<commit_message>
Add security and documentation updates
</commit_message>
<xml_diff>
--- a/docs/MyOKUcare_User_Guide_Web_and_App.docx
+++ b/docs/MyOKUcare_User_Guide_Web_and_App.docx
@@ -15,7 +15,7 @@
         <w:drawing>
           <wp:inline xmlns:a="http://schemas.openxmlformats.org/drawingml/2006/main" xmlns:pic="http://schemas.openxmlformats.org/drawingml/2006/picture">
             <wp:extent cx="1234440" cy="1234440"/>
-            <wp:docPr id="1" name="Picture 1"/>
+            <wp:docPr id="1" name="Picture 1" descr="MyOKUcare logo"/>
             <wp:cNvGraphicFramePr>
               <a:graphicFrameLocks noChangeAspect="1"/>
             </wp:cNvGraphicFramePr>
@@ -5334,7 +5334,7 @@
     </w:p>
     <w:p>
       <w:r>
-        <w:t>This guide reflects the MyOKUcare testing build as of 27 July 2026. The core workflows are available, but final production release still requires client UAT, complete password recovery and email verification, notifications, formal privacy and retention review, production infrastructure testing and written client approval.</w:t>
+        <w:t>This guide reflects the MyOKUcare testing build as of 27 July 2026. The core workflows and the current security regression controls are available, but final production release still requires client UAT, accessible account recovery and email verification, notifications, formal privacy and retention review, production infrastructure testing and written client approval.</w:t>
       </w:r>
     </w:p>
     <w:tbl>
@@ -5377,6 +5377,64 @@
       <w:pPr>
         <w:spacing w:after="0"/>
       </w:pPr>
+    </w:p>
+    <w:p>
+      <w:pPr>
+        <w:pStyle w:val="Heading1"/>
+      </w:pPr>
+      <w:r>
+        <w:t>14. PWA Sessions and Planned Account Recovery</w:t>
+      </w:r>
+    </w:p>
+    <w:p>
+      <w:r>
+        <w:t>The installed PWA uses the same server-side Laravel session as the website. Authenticated pages and API responses require a network connection and are not stored by the service worker for offline viewing.</w:t>
+      </w:r>
+    </w:p>
+    <w:p>
+      <w:pPr>
+        <w:pStyle w:val="ListBullet"/>
+      </w:pPr>
+      <w:r>
+        <w:t>Current users sign in with their registered email address and password. Account recovery is not yet implemented.</w:t>
+      </w:r>
+    </w:p>
+    <w:p>
+      <w:pPr>
+        <w:pStyle w:val="ListBullet"/>
+      </w:pPr>
+      <w:r>
+        <w:t>A future trusted-device option may keep an OKU user signed in for up to 30 days on a personal device. It must never store the password or session identifier in browser storage.</w:t>
+      </w:r>
+    </w:p>
+    <w:p>
+      <w:pPr>
+        <w:pStyle w:val="ListBullet"/>
+      </w:pPr>
+      <w:r>
+        <w:t>Planned recovery methods are an expiring email reset link, an approved one-time SMS code, a passkey using the device biometric or PIN, and controlled JKM-assisted recovery.</w:t>
+      </w:r>
+    </w:p>
+    <w:p>
+      <w:pPr>
+        <w:pStyle w:val="ListBullet"/>
+      </w:pPr>
+      <w:r>
+        <w:t>JKM officers must never ask for or view an existing password. Assisted recovery must verify the person and create an audit record.</w:t>
+      </w:r>
+    </w:p>
+    <w:p>
+      <w:pPr>
+        <w:pStyle w:val="ListBullet"/>
+      </w:pPr>
+      <w:r>
+        <w:t>Users must select Log Out on shared devices. Logout, account deactivation, password reset and a reported lost device must revoke applicable sessions.</w:t>
+      </w:r>
+    </w:p>
+    <w:p>
+      <w:r>
+        <w:t>Implementation status: planned next phase. Detailed requirements are maintained in docs/AUTHENTICATION_RECOVERY_PLAN.md.</w:t>
+      </w:r>
     </w:p>
     <w:sectPr>
       <w:headerReference w:type="default" r:id="rId9"/>

</xml_diff>